<commit_message>
rework Milaor role: user champion liaison, Syspro/DMS/MyBuddy/OLAP cube, EOD Nestle reporting
</commit_message>
<xml_diff>
--- a/public/Tristan-Vegas-Resume.docx
+++ b/public/Tristan-Vegas-Resume.docx
@@ -86,7 +86,7 @@
           <w:szCs w:val="21"/>
           <w:lang w:val="en"/>
         </w:rPr>
-        <w:pict w14:anchorId="49AB130E">
+        <w:pict w14:anchorId="6ADB36B8">
           <v:rect id="_x0000_i1025" style="width:0;height:1.5pt" o:hralign="center" o:hrstd="t" o:hr="t" fillcolor="#a0a0a0" stroked="f"/>
         </w:pict>
       </w:r>
@@ -212,7 +212,7 @@
           <w:szCs w:val="21"/>
           <w:lang w:val="en"/>
         </w:rPr>
-        <w:t>Supervised warehouse encoders for accurate sales and inventory data.</w:t>
+        <w:t xml:space="preserve">Served as the first point of contact for clients, salespeople, encoders and staff — resolving system errors and access issues day to day. </w:t>
       </w:r>
     </w:p>
     <w:p>
@@ -238,7 +238,7 @@
           <w:szCs w:val="21"/>
           <w:lang w:val="en"/>
         </w:rPr>
-        <w:t>Built sales and inventory reports with Excel and SQL.</w:t>
+        <w:t xml:space="preserve">Acted as the bridge between end users and the Nestlé IT &amp; sales teams, communicating issues and follow-ups until resolved. </w:t>
       </w:r>
     </w:p>
     <w:p>
@@ -264,6 +264,58 @@
           <w:szCs w:val="21"/>
           <w:lang w:val="en"/>
         </w:rPr>
+        <w:t xml:space="preserve">Supervised warehouse encoders entering sales and inventory data into Syspro, DMS, MyBuddy, and an Excel-based OLAP cube (local database queried via Excel). </w:t>
+      </w:r>
+    </w:p>
+    <w:p>
+      <w:pPr>
+        <w:numPr>
+          <w:ilvl w:val="0"/>
+          <w:numId w:val="1"/>
+        </w:numPr>
+        <w:spacing w:before="100" w:beforeAutospacing="1" w:after="40"/>
+        <w:rPr>
+          <w:rFonts w:ascii="Segoe UI" w:eastAsia="Times New Roman" w:hAnsi="Segoe UI" w:cs="Segoe UI"/>
+          <w:color w:val="18181B"/>
+          <w:sz w:val="21"/>
+          <w:szCs w:val="21"/>
+          <w:lang w:val="en"/>
+        </w:rPr>
+      </w:pPr>
+      <w:r>
+        <w:rPr>
+          <w:rFonts w:ascii="Segoe UI" w:eastAsia="Times New Roman" w:hAnsi="Segoe UI" w:cs="Segoe UI"/>
+          <w:color w:val="18181B"/>
+          <w:sz w:val="21"/>
+          <w:szCs w:val="21"/>
+          <w:lang w:val="en"/>
+        </w:rPr>
+        <w:t xml:space="preserve">Prepared and sent end-of-day sales and inventory reports to Nestlé, plus other operational reporting. </w:t>
+      </w:r>
+    </w:p>
+    <w:p>
+      <w:pPr>
+        <w:numPr>
+          <w:ilvl w:val="0"/>
+          <w:numId w:val="1"/>
+        </w:numPr>
+        <w:spacing w:before="100" w:beforeAutospacing="1" w:after="40"/>
+        <w:rPr>
+          <w:rFonts w:ascii="Segoe UI" w:eastAsia="Times New Roman" w:hAnsi="Segoe UI" w:cs="Segoe UI"/>
+          <w:color w:val="18181B"/>
+          <w:sz w:val="21"/>
+          <w:szCs w:val="21"/>
+          <w:lang w:val="en"/>
+        </w:rPr>
+      </w:pPr>
+      <w:r>
+        <w:rPr>
+          <w:rFonts w:ascii="Segoe UI" w:eastAsia="Times New Roman" w:hAnsi="Segoe UI" w:cs="Segoe UI"/>
+          <w:color w:val="18181B"/>
+          <w:sz w:val="21"/>
+          <w:szCs w:val="21"/>
+          <w:lang w:val="en"/>
+        </w:rPr>
         <w:t>Flagged stock discrepancies to support management decisions.</w:t>
       </w:r>
     </w:p>
@@ -478,6 +530,7 @@
           <w:szCs w:val="21"/>
           <w:lang w:val="en"/>
         </w:rPr>
+        <w:lastRenderedPageBreak/>
         <w:t xml:space="preserve">Delivered mobile and web projects for various clients, from concept through deployment. </w:t>
       </w:r>
     </w:p>
@@ -522,15 +575,7 @@
           <w:color w:val="18181B"/>
           <w:lang w:val="en"/>
         </w:rPr>
-        <w:t xml:space="preserve">On the Job Training — </w:t>
-      </w:r>
-      <w:r>
-        <w:rPr>
-          <w:rFonts w:ascii="Segoe UI" w:eastAsia="Times New Roman" w:hAnsi="Segoe UI" w:cs="Segoe UI"/>
-          <w:color w:val="18181B"/>
-          <w:lang w:val="en"/>
-        </w:rPr>
-        <w:t>Tokyo System Solutions</w:t>
+        <w:t>On the Job Training — Tokyo System Solutions</w:t>
       </w:r>
     </w:p>
     <w:p>
@@ -546,7 +591,14 @@
           <w:rFonts w:ascii="Segoe UI" w:hAnsi="Segoe UI" w:cs="Segoe UI"/>
           <w:lang w:val="en"/>
         </w:rPr>
-        <w:t xml:space="preserve">April 2018 – July 2018  |  Internship  |  Unit 205, Citrine Building, Magsaysay Ave, Naga City </w:t>
+        <w:t xml:space="preserve">April 2018 – July 2018  |  Internship  |  Unit </w:t>
+      </w:r>
+      <w:r>
+        <w:rPr>
+          <w:rFonts w:ascii="Segoe UI" w:hAnsi="Segoe UI" w:cs="Segoe UI"/>
+          <w:lang w:val="en"/>
+        </w:rPr>
+        <w:t xml:space="preserve">205, Citrine Building, Magsaysay Ave, Naga City </w:t>
       </w:r>
     </w:p>
     <w:p>
@@ -572,7 +624,6 @@
           <w:szCs w:val="21"/>
           <w:lang w:val="en"/>
         </w:rPr>
-        <w:lastRenderedPageBreak/>
         <w:t xml:space="preserve">Created a Human Resource and Web Application that can be used for other companies. </w:t>
       </w:r>
     </w:p>
@@ -620,7 +671,7 @@
     </w:p>
     <w:p>
       <w:pPr>
-        <w:divId w:val="25494863"/>
+        <w:divId w:val="844321745"/>
         <w:rPr>
           <w:rFonts w:ascii="Segoe UI" w:eastAsia="Times New Roman" w:hAnsi="Segoe UI" w:cs="Segoe UI"/>
           <w:color w:val="18181B"/>
@@ -654,7 +705,7 @@
     </w:p>
     <w:p>
       <w:pPr>
-        <w:divId w:val="999696648"/>
+        <w:divId w:val="681510772"/>
         <w:rPr>
           <w:rFonts w:ascii="Segoe UI" w:eastAsia="Times New Roman" w:hAnsi="Segoe UI" w:cs="Segoe UI"/>
           <w:color w:val="18181B"/>
@@ -688,7 +739,7 @@
     </w:p>
     <w:p>
       <w:pPr>
-        <w:divId w:val="1010333882"/>
+        <w:divId w:val="1949510746"/>
         <w:rPr>
           <w:rFonts w:ascii="Segoe UI" w:eastAsia="Times New Roman" w:hAnsi="Segoe UI" w:cs="Segoe UI"/>
           <w:color w:val="18181B"/>
@@ -722,7 +773,7 @@
     </w:p>
     <w:p>
       <w:pPr>
-        <w:divId w:val="304939859"/>
+        <w:divId w:val="481045498"/>
         <w:rPr>
           <w:rFonts w:ascii="Segoe UI" w:eastAsia="Times New Roman" w:hAnsi="Segoe UI" w:cs="Segoe UI"/>
           <w:color w:val="18181B"/>
@@ -756,7 +807,7 @@
     </w:p>
     <w:p>
       <w:pPr>
-        <w:divId w:val="213591060"/>
+        <w:divId w:val="397750327"/>
         <w:rPr>
           <w:rFonts w:ascii="Segoe UI" w:eastAsia="Times New Roman" w:hAnsi="Segoe UI" w:cs="Segoe UI"/>
           <w:color w:val="18181B"/>
@@ -790,7 +841,7 @@
     </w:p>
     <w:p>
       <w:pPr>
-        <w:divId w:val="954141884"/>
+        <w:divId w:val="1248660241"/>
         <w:rPr>
           <w:rFonts w:ascii="Segoe UI" w:eastAsia="Times New Roman" w:hAnsi="Segoe UI" w:cs="Segoe UI"/>
           <w:color w:val="18181B"/>
@@ -824,7 +875,7 @@
     </w:p>
     <w:p>
       <w:pPr>
-        <w:divId w:val="280501609"/>
+        <w:divId w:val="251546178"/>
         <w:rPr>
           <w:rFonts w:ascii="Segoe UI" w:eastAsia="Times New Roman" w:hAnsi="Segoe UI" w:cs="Segoe UI"/>
           <w:color w:val="18181B"/>
@@ -858,7 +909,7 @@
     </w:p>
     <w:p>
       <w:pPr>
-        <w:divId w:val="1511945333"/>
+        <w:divId w:val="1422599462"/>
         <w:rPr>
           <w:rFonts w:ascii="Segoe UI" w:eastAsia="Times New Roman" w:hAnsi="Segoe UI" w:cs="Segoe UI"/>
           <w:color w:val="18181B"/>
@@ -892,7 +943,7 @@
     </w:p>
     <w:p>
       <w:pPr>
-        <w:divId w:val="1563445261"/>
+        <w:divId w:val="1195119578"/>
         <w:rPr>
           <w:rFonts w:ascii="Segoe UI" w:eastAsia="Times New Roman" w:hAnsi="Segoe UI" w:cs="Segoe UI"/>
           <w:color w:val="18181B"/>
@@ -1064,7 +1115,7 @@
     <w:p>
       <w:pPr>
         <w:pStyle w:val="Heading3"/>
-        <w:divId w:val="677541478"/>
+        <w:divId w:val="815954762"/>
         <w:rPr>
           <w:rFonts w:ascii="Segoe UI" w:eastAsia="Times New Roman" w:hAnsi="Segoe UI" w:cs="Segoe UI"/>
           <w:color w:val="18181B"/>
@@ -1083,7 +1134,7 @@
     <w:p>
       <w:pPr>
         <w:pStyle w:val="NormalWeb"/>
-        <w:divId w:val="677541478"/>
+        <w:divId w:val="815954762"/>
         <w:rPr>
           <w:rFonts w:ascii="Segoe UI" w:hAnsi="Segoe UI" w:cs="Segoe UI"/>
           <w:color w:val="18181B"/>
@@ -1106,24 +1157,25 @@
     <w:p>
       <w:pPr>
         <w:pStyle w:val="tools1"/>
-        <w:divId w:val="677541478"/>
-        <w:rPr>
-          <w:rFonts w:ascii="Segoe UI" w:hAnsi="Segoe UI" w:cs="Segoe UI"/>
-          <w:lang w:val="en"/>
-        </w:rPr>
-      </w:pPr>
-      <w:r>
-        <w:rPr>
-          <w:rFonts w:ascii="Segoe UI" w:hAnsi="Segoe UI" w:cs="Segoe UI"/>
-          <w:lang w:val="en"/>
-        </w:rPr>
+        <w:divId w:val="815954762"/>
+        <w:rPr>
+          <w:rFonts w:ascii="Segoe UI" w:hAnsi="Segoe UI" w:cs="Segoe UI"/>
+          <w:lang w:val="en"/>
+        </w:rPr>
+      </w:pPr>
+      <w:r>
+        <w:rPr>
+          <w:rFonts w:ascii="Segoe UI" w:hAnsi="Segoe UI" w:cs="Segoe UI"/>
+          <w:lang w:val="en"/>
+        </w:rPr>
+        <w:lastRenderedPageBreak/>
         <w:t xml:space="preserve">Next.js  ·  TypeScript  ·  PostgreSQL  ·  Prisma  ·  OpenAI </w:t>
       </w:r>
     </w:p>
     <w:p>
       <w:pPr>
         <w:pStyle w:val="Heading3"/>
-        <w:divId w:val="1328826011"/>
+        <w:divId w:val="1901439"/>
         <w:rPr>
           <w:rFonts w:ascii="Segoe UI" w:eastAsia="Times New Roman" w:hAnsi="Segoe UI" w:cs="Segoe UI"/>
           <w:color w:val="18181B"/>
@@ -1142,7 +1194,7 @@
     <w:p>
       <w:pPr>
         <w:pStyle w:val="NormalWeb"/>
-        <w:divId w:val="1328826011"/>
+        <w:divId w:val="1901439"/>
         <w:rPr>
           <w:rFonts w:ascii="Segoe UI" w:hAnsi="Segoe UI" w:cs="Segoe UI"/>
           <w:color w:val="18181B"/>
@@ -1165,7 +1217,371 @@
     <w:p>
       <w:pPr>
         <w:pStyle w:val="tools1"/>
-        <w:divId w:val="1328826011"/>
+        <w:divId w:val="1901439"/>
+        <w:rPr>
+          <w:rFonts w:ascii="Segoe UI" w:hAnsi="Segoe UI" w:cs="Segoe UI"/>
+          <w:lang w:val="en"/>
+        </w:rPr>
+      </w:pPr>
+      <w:r>
+        <w:rPr>
+          <w:rFonts w:ascii="Segoe UI" w:hAnsi="Segoe UI" w:cs="Segoe UI"/>
+          <w:lang w:val="en"/>
+        </w:rPr>
+        <w:t xml:space="preserve">Node.js  ·  Express  ·  React  ·  Full-Stack </w:t>
+      </w:r>
+    </w:p>
+    <w:p>
+      <w:pPr>
+        <w:pStyle w:val="Heading3"/>
+        <w:divId w:val="495342225"/>
+        <w:rPr>
+          <w:rFonts w:ascii="Segoe UI" w:eastAsia="Times New Roman" w:hAnsi="Segoe UI" w:cs="Segoe UI"/>
+          <w:color w:val="18181B"/>
+          <w:lang w:val="en"/>
+        </w:rPr>
+      </w:pPr>
+      <w:r>
+        <w:rPr>
+          <w:rFonts w:ascii="Segoe UI" w:eastAsia="Times New Roman" w:hAnsi="Segoe UI" w:cs="Segoe UI"/>
+          <w:color w:val="18181B"/>
+          <w:lang w:val="en"/>
+        </w:rPr>
+        <w:t>Warehouse Inventory System</w:t>
+      </w:r>
+    </w:p>
+    <w:p>
+      <w:pPr>
+        <w:pStyle w:val="NormalWeb"/>
+        <w:divId w:val="495342225"/>
+        <w:rPr>
+          <w:rFonts w:ascii="Segoe UI" w:hAnsi="Segoe UI" w:cs="Segoe UI"/>
+          <w:color w:val="18181B"/>
+          <w:sz w:val="21"/>
+          <w:szCs w:val="21"/>
+          <w:lang w:val="en"/>
+        </w:rPr>
+      </w:pPr>
+      <w:r>
+        <w:rPr>
+          <w:rFonts w:ascii="Segoe UI" w:hAnsi="Segoe UI" w:cs="Segoe UI"/>
+          <w:color w:val="18181B"/>
+          <w:sz w:val="21"/>
+          <w:szCs w:val="21"/>
+          <w:lang w:val="en"/>
+        </w:rPr>
+        <w:t xml:space="preserve">Web-based inventory management with real-time stock monitoring, </w:t>
+      </w:r>
+      <w:r>
+        <w:rPr>
+          <w:rFonts w:ascii="Segoe UI" w:hAnsi="Segoe UI" w:cs="Segoe UI"/>
+          <w:color w:val="18181B"/>
+          <w:sz w:val="21"/>
+          <w:szCs w:val="21"/>
+          <w:lang w:val="en"/>
+        </w:rPr>
+        <w:t xml:space="preserve">low-stock alerts, and centralized data via SQL Server (SSMS); React.js interface for efficient tracking. </w:t>
+      </w:r>
+    </w:p>
+    <w:p>
+      <w:pPr>
+        <w:pStyle w:val="tools1"/>
+        <w:divId w:val="495342225"/>
+        <w:rPr>
+          <w:rFonts w:ascii="Segoe UI" w:hAnsi="Segoe UI" w:cs="Segoe UI"/>
+          <w:lang w:val="en"/>
+        </w:rPr>
+      </w:pPr>
+      <w:r>
+        <w:rPr>
+          <w:rFonts w:ascii="Segoe UI" w:hAnsi="Segoe UI" w:cs="Segoe UI"/>
+          <w:lang w:val="en"/>
+        </w:rPr>
+        <w:t xml:space="preserve">React.js  ·  SQL Server  ·  SSMS  ·  Full-Stack </w:t>
+      </w:r>
+    </w:p>
+    <w:p>
+      <w:pPr>
+        <w:pStyle w:val="Heading3"/>
+        <w:divId w:val="683702650"/>
+        <w:rPr>
+          <w:rFonts w:ascii="Segoe UI" w:eastAsia="Times New Roman" w:hAnsi="Segoe UI" w:cs="Segoe UI"/>
+          <w:color w:val="18181B"/>
+          <w:lang w:val="en"/>
+        </w:rPr>
+      </w:pPr>
+      <w:r>
+        <w:rPr>
+          <w:rFonts w:ascii="Segoe UI" w:eastAsia="Times New Roman" w:hAnsi="Segoe UI" w:cs="Segoe UI"/>
+          <w:color w:val="18181B"/>
+          <w:lang w:val="en"/>
+        </w:rPr>
+        <w:t>Tour &amp; Travel Management System</w:t>
+      </w:r>
+    </w:p>
+    <w:p>
+      <w:pPr>
+        <w:pStyle w:val="NormalWeb"/>
+        <w:divId w:val="683702650"/>
+        <w:rPr>
+          <w:rFonts w:ascii="Segoe UI" w:hAnsi="Segoe UI" w:cs="Segoe UI"/>
+          <w:color w:val="18181B"/>
+          <w:sz w:val="21"/>
+          <w:szCs w:val="21"/>
+          <w:lang w:val="en"/>
+        </w:rPr>
+      </w:pPr>
+      <w:r>
+        <w:rPr>
+          <w:rFonts w:ascii="Segoe UI" w:hAnsi="Segoe UI" w:cs="Segoe UI"/>
+          <w:color w:val="18181B"/>
+          <w:sz w:val="21"/>
+          <w:szCs w:val="21"/>
+          <w:lang w:val="en"/>
+        </w:rPr>
+        <w:t xml:space="preserve">Client-facing booking website, itinerary and tour management, mobile admin app with notifications, and booking/payment approval workflows. </w:t>
+      </w:r>
+    </w:p>
+    <w:p>
+      <w:pPr>
+        <w:pStyle w:val="tools1"/>
+        <w:divId w:val="683702650"/>
+        <w:rPr>
+          <w:rFonts w:ascii="Segoe UI" w:hAnsi="Segoe UI" w:cs="Segoe UI"/>
+          <w:lang w:val="en"/>
+        </w:rPr>
+      </w:pPr>
+      <w:r>
+        <w:rPr>
+          <w:rFonts w:ascii="Segoe UI" w:hAnsi="Segoe UI" w:cs="Segoe UI"/>
+          <w:lang w:val="en"/>
+        </w:rPr>
+        <w:t xml:space="preserve">Laravel  ·  MySQL  ·  Web  ·  Mobile </w:t>
+      </w:r>
+    </w:p>
+    <w:p>
+      <w:pPr>
+        <w:pStyle w:val="Heading3"/>
+        <w:divId w:val="1885478027"/>
+        <w:rPr>
+          <w:rFonts w:ascii="Segoe UI" w:eastAsia="Times New Roman" w:hAnsi="Segoe UI" w:cs="Segoe UI"/>
+          <w:color w:val="18181B"/>
+          <w:lang w:val="en"/>
+        </w:rPr>
+      </w:pPr>
+      <w:r>
+        <w:rPr>
+          <w:rFonts w:ascii="Segoe UI" w:eastAsia="Times New Roman" w:hAnsi="Segoe UI" w:cs="Segoe UI"/>
+          <w:color w:val="18181B"/>
+          <w:lang w:val="en"/>
+        </w:rPr>
+        <w:t>Student Enrollment System</w:t>
+      </w:r>
+    </w:p>
+    <w:p>
+      <w:pPr>
+        <w:pStyle w:val="NormalWeb"/>
+        <w:divId w:val="1885478027"/>
+        <w:rPr>
+          <w:rFonts w:ascii="Segoe UI" w:hAnsi="Segoe UI" w:cs="Segoe UI"/>
+          <w:color w:val="18181B"/>
+          <w:sz w:val="21"/>
+          <w:szCs w:val="21"/>
+          <w:lang w:val="en"/>
+        </w:rPr>
+      </w:pPr>
+      <w:r>
+        <w:rPr>
+          <w:rFonts w:ascii="Segoe UI" w:hAnsi="Segoe UI" w:cs="Segoe UI"/>
+          <w:color w:val="18181B"/>
+          <w:sz w:val="21"/>
+          <w:szCs w:val="21"/>
+          <w:lang w:val="en"/>
+        </w:rPr>
+        <w:t xml:space="preserve">Backend for student enrollment: authentication, registration, course assignments, relational database, RESTful APIs, and role-based access control. </w:t>
+      </w:r>
+    </w:p>
+    <w:p>
+      <w:pPr>
+        <w:pStyle w:val="tools1"/>
+        <w:divId w:val="1885478027"/>
+        <w:rPr>
+          <w:rFonts w:ascii="Segoe UI" w:hAnsi="Segoe UI" w:cs="Segoe UI"/>
+          <w:lang w:val="en"/>
+        </w:rPr>
+      </w:pPr>
+      <w:r>
+        <w:rPr>
+          <w:rFonts w:ascii="Segoe UI" w:hAnsi="Segoe UI" w:cs="Segoe UI"/>
+          <w:lang w:val="en"/>
+        </w:rPr>
+        <w:t xml:space="preserve">PHP (Laravel)  ·  MySQL  ·  REST API </w:t>
+      </w:r>
+    </w:p>
+    <w:p>
+      <w:pPr>
+        <w:pStyle w:val="Heading3"/>
+        <w:divId w:val="555553342"/>
+        <w:rPr>
+          <w:rFonts w:ascii="Segoe UI" w:eastAsia="Times New Roman" w:hAnsi="Segoe UI" w:cs="Segoe UI"/>
+          <w:color w:val="18181B"/>
+          <w:lang w:val="en"/>
+        </w:rPr>
+      </w:pPr>
+      <w:r>
+        <w:rPr>
+          <w:rFonts w:ascii="Segoe UI" w:eastAsia="Times New Roman" w:hAnsi="Segoe UI" w:cs="Segoe UI"/>
+          <w:color w:val="18181B"/>
+          <w:lang w:val="en"/>
+        </w:rPr>
+        <w:t>Lending Management System</w:t>
+      </w:r>
+    </w:p>
+    <w:p>
+      <w:pPr>
+        <w:pStyle w:val="NormalWeb"/>
+        <w:divId w:val="555553342"/>
+        <w:rPr>
+          <w:rFonts w:ascii="Segoe UI" w:hAnsi="Segoe UI" w:cs="Segoe UI"/>
+          <w:color w:val="18181B"/>
+          <w:sz w:val="21"/>
+          <w:szCs w:val="21"/>
+          <w:lang w:val="en"/>
+        </w:rPr>
+      </w:pPr>
+      <w:r>
+        <w:rPr>
+          <w:rFonts w:ascii="Segoe UI" w:hAnsi="Segoe UI" w:cs="Segoe UI"/>
+          <w:color w:val="18181B"/>
+          <w:sz w:val="21"/>
+          <w:szCs w:val="21"/>
+          <w:lang w:val="en"/>
+        </w:rPr>
+        <w:t xml:space="preserve">Standalone Windows desktop app with loan tracking, payment scheduling, interest calculation, and MySQL data storage. </w:t>
+      </w:r>
+    </w:p>
+    <w:p>
+      <w:pPr>
+        <w:pStyle w:val="tools1"/>
+        <w:divId w:val="555553342"/>
+        <w:rPr>
+          <w:rFonts w:ascii="Segoe UI" w:hAnsi="Segoe UI" w:cs="Segoe UI"/>
+          <w:lang w:val="en"/>
+        </w:rPr>
+      </w:pPr>
+      <w:r>
+        <w:rPr>
+          <w:rFonts w:ascii="Segoe UI" w:hAnsi="Segoe UI" w:cs="Segoe UI"/>
+          <w:lang w:val="en"/>
+        </w:rPr>
+        <w:t>C#  ·  .NET Framework  ·  MySQL</w:t>
+      </w:r>
+    </w:p>
+    <w:p>
+      <w:pPr>
+        <w:pStyle w:val="Heading3"/>
+        <w:divId w:val="1424837103"/>
+        <w:rPr>
+          <w:rFonts w:ascii="Segoe UI" w:eastAsia="Times New Roman" w:hAnsi="Segoe UI" w:cs="Segoe UI"/>
+          <w:color w:val="18181B"/>
+          <w:lang w:val="en"/>
+        </w:rPr>
+      </w:pPr>
+      <w:r>
+        <w:rPr>
+          <w:rFonts w:ascii="Segoe UI" w:eastAsia="Times New Roman" w:hAnsi="Segoe UI" w:cs="Segoe UI"/>
+          <w:color w:val="18181B"/>
+          <w:lang w:val="en"/>
+        </w:rPr>
+        <w:t>Desktop POS System — Pizza Restaurant</w:t>
+      </w:r>
+    </w:p>
+    <w:p>
+      <w:pPr>
+        <w:pStyle w:val="NormalWeb"/>
+        <w:divId w:val="1424837103"/>
+        <w:rPr>
+          <w:rFonts w:ascii="Segoe UI" w:hAnsi="Segoe UI" w:cs="Segoe UI"/>
+          <w:color w:val="18181B"/>
+          <w:sz w:val="21"/>
+          <w:szCs w:val="21"/>
+          <w:lang w:val="en"/>
+        </w:rPr>
+      </w:pPr>
+      <w:r>
+        <w:rPr>
+          <w:rFonts w:ascii="Segoe UI" w:hAnsi="Segoe UI" w:cs="Segoe UI"/>
+          <w:color w:val="18181B"/>
+          <w:sz w:val="21"/>
+          <w:szCs w:val="21"/>
+          <w:lang w:val="en"/>
+        </w:rPr>
+        <w:t xml:space="preserve">Desktop point-of-sales for orders, products, inventory, and sales transactions; independent college project. </w:t>
+      </w:r>
+    </w:p>
+    <w:p>
+      <w:pPr>
+        <w:pStyle w:val="tools1"/>
+        <w:divId w:val="1424837103"/>
+        <w:rPr>
+          <w:rFonts w:ascii="Segoe UI" w:hAnsi="Segoe UI" w:cs="Segoe UI"/>
+          <w:lang w:val="en"/>
+        </w:rPr>
+      </w:pPr>
+      <w:r>
+        <w:rPr>
+          <w:rFonts w:ascii="Segoe UI" w:hAnsi="Segoe UI" w:cs="Segoe UI"/>
+          <w:lang w:val="en"/>
+        </w:rPr>
+        <w:t xml:space="preserve">C#  ·  Visual Studio  ·  SQL Server  ·  SSMS </w:t>
+      </w:r>
+    </w:p>
+    <w:p>
+      <w:pPr>
+        <w:pStyle w:val="Heading3"/>
+        <w:divId w:val="1963145992"/>
+        <w:rPr>
+          <w:rFonts w:ascii="Segoe UI" w:eastAsia="Times New Roman" w:hAnsi="Segoe UI" w:cs="Segoe UI"/>
+          <w:color w:val="18181B"/>
+          <w:lang w:val="en"/>
+        </w:rPr>
+      </w:pPr>
+      <w:r>
+        <w:rPr>
+          <w:rFonts w:ascii="Segoe UI" w:eastAsia="Times New Roman" w:hAnsi="Segoe UI" w:cs="Segoe UI"/>
+          <w:color w:val="18181B"/>
+          <w:lang w:val="en"/>
+        </w:rPr>
+        <w:t>Educational Multiplayer Math Game</w:t>
+      </w:r>
+    </w:p>
+    <w:p>
+      <w:pPr>
+        <w:pStyle w:val="NormalWeb"/>
+        <w:divId w:val="1963145992"/>
+        <w:rPr>
+          <w:rFonts w:ascii="Segoe UI" w:hAnsi="Segoe UI" w:cs="Segoe UI"/>
+          <w:color w:val="18181B"/>
+          <w:sz w:val="21"/>
+          <w:szCs w:val="21"/>
+          <w:lang w:val="en"/>
+        </w:rPr>
+      </w:pPr>
+      <w:r>
+        <w:rPr>
+          <w:rFonts w:ascii="Segoe UI" w:hAnsi="Segoe UI" w:cs="Segoe UI"/>
+          <w:color w:val="18181B"/>
+          <w:sz w:val="21"/>
+          <w:szCs w:val="21"/>
+          <w:lang w:val="en"/>
+        </w:rPr>
+        <w:t xml:space="preserve">Prototype multiplayer math-learning mobile game with real-time Node.js / Socket.IO backend. </w:t>
+      </w:r>
+    </w:p>
+    <w:p>
+      <w:pPr>
+        <w:pStyle w:val="tools1"/>
+        <w:divId w:val="1963145992"/>
         <w:rPr>
           <w:rFonts w:ascii="Segoe UI" w:hAnsi="Segoe UI" w:cs="Segoe UI"/>
           <w:lang w:val="en"/>
@@ -1177,420 +1593,65 @@
           <w:lang w:val="en"/>
         </w:rPr>
         <w:lastRenderedPageBreak/>
-        <w:t xml:space="preserve">Node.js  ·  Express  ·  React  ·  Full-Stack </w:t>
+        <w:t>Java  ·  Node.js  ·  Socket.IO</w:t>
       </w:r>
     </w:p>
     <w:p>
       <w:pPr>
         <w:pStyle w:val="Heading3"/>
-        <w:divId w:val="918442132"/>
-        <w:rPr>
-          <w:rFonts w:ascii="Segoe UI" w:eastAsia="Times New Roman" w:hAnsi="Segoe UI" w:cs="Segoe UI"/>
-          <w:color w:val="18181B"/>
-          <w:lang w:val="en"/>
-        </w:rPr>
-      </w:pPr>
-      <w:r>
-        <w:rPr>
-          <w:rFonts w:ascii="Segoe UI" w:eastAsia="Times New Roman" w:hAnsi="Segoe UI" w:cs="Segoe UI"/>
-          <w:color w:val="18181B"/>
-          <w:lang w:val="en"/>
-        </w:rPr>
-        <w:t>Warehouse Inventory System</w:t>
+        <w:divId w:val="1060713229"/>
+        <w:rPr>
+          <w:rFonts w:ascii="Segoe UI" w:eastAsia="Times New Roman" w:hAnsi="Segoe UI" w:cs="Segoe UI"/>
+          <w:color w:val="18181B"/>
+          <w:lang w:val="en"/>
+        </w:rPr>
+      </w:pPr>
+      <w:r>
+        <w:rPr>
+          <w:rFonts w:ascii="Segoe UI" w:eastAsia="Times New Roman" w:hAnsi="Segoe UI" w:cs="Segoe UI"/>
+          <w:color w:val="18181B"/>
+          <w:lang w:val="en"/>
+        </w:rPr>
+        <w:t>Laundry Shop Web &amp; Mobile Application</w:t>
       </w:r>
     </w:p>
     <w:p>
       <w:pPr>
         <w:pStyle w:val="NormalWeb"/>
-        <w:divId w:val="918442132"/>
-        <w:rPr>
-          <w:rFonts w:ascii="Segoe UI" w:hAnsi="Segoe UI" w:cs="Segoe UI"/>
-          <w:color w:val="18181B"/>
-          <w:sz w:val="21"/>
-          <w:szCs w:val="21"/>
-          <w:lang w:val="en"/>
-        </w:rPr>
-      </w:pPr>
-      <w:r>
-        <w:rPr>
-          <w:rFonts w:ascii="Segoe UI" w:hAnsi="Segoe UI" w:cs="Segoe UI"/>
-          <w:color w:val="18181B"/>
-          <w:sz w:val="21"/>
-          <w:szCs w:val="21"/>
-          <w:lang w:val="en"/>
-        </w:rPr>
-        <w:t xml:space="preserve">Web-based inventory management with real-time stock monitoring, low-stock alerts, and centralized data via SQL Server (SSMS); React.js interface for efficient tracking. </w:t>
+        <w:divId w:val="1060713229"/>
+        <w:rPr>
+          <w:rFonts w:ascii="Segoe UI" w:hAnsi="Segoe UI" w:cs="Segoe UI"/>
+          <w:color w:val="18181B"/>
+          <w:sz w:val="21"/>
+          <w:szCs w:val="21"/>
+          <w:lang w:val="en"/>
+        </w:rPr>
+      </w:pPr>
+      <w:r>
+        <w:rPr>
+          <w:rFonts w:ascii="Segoe UI" w:hAnsi="Segoe UI" w:cs="Segoe UI"/>
+          <w:color w:val="18181B"/>
+          <w:sz w:val="21"/>
+          <w:szCs w:val="21"/>
+          <w:lang w:val="en"/>
+        </w:rPr>
+        <w:t xml:space="preserve">Full-stack web and mobile app with customer management, payment integration, and responsive UI. </w:t>
       </w:r>
     </w:p>
     <w:p>
       <w:pPr>
         <w:pStyle w:val="tools1"/>
-        <w:divId w:val="918442132"/>
-        <w:rPr>
-          <w:rFonts w:ascii="Segoe UI" w:hAnsi="Segoe UI" w:cs="Segoe UI"/>
-          <w:lang w:val="en"/>
-        </w:rPr>
-      </w:pPr>
-      <w:r>
-        <w:rPr>
-          <w:rFonts w:ascii="Segoe UI" w:hAnsi="Segoe UI" w:cs="Segoe UI"/>
-          <w:lang w:val="en"/>
-        </w:rPr>
-        <w:t xml:space="preserve">React.js  ·  SQL Server  ·  SSMS  ·  Full-Stack </w:t>
-      </w:r>
-    </w:p>
-    <w:p>
-      <w:pPr>
-        <w:pStyle w:val="Heading3"/>
-        <w:divId w:val="1702627145"/>
-        <w:rPr>
-          <w:rFonts w:ascii="Segoe UI" w:eastAsia="Times New Roman" w:hAnsi="Segoe UI" w:cs="Segoe UI"/>
-          <w:color w:val="18181B"/>
-          <w:lang w:val="en"/>
-        </w:rPr>
-      </w:pPr>
-      <w:r>
-        <w:rPr>
-          <w:rFonts w:ascii="Segoe UI" w:eastAsia="Times New Roman" w:hAnsi="Segoe UI" w:cs="Segoe UI"/>
-          <w:color w:val="18181B"/>
-          <w:lang w:val="en"/>
-        </w:rPr>
-        <w:t>Tour &amp; Travel Management System</w:t>
-      </w:r>
-    </w:p>
-    <w:p>
-      <w:pPr>
-        <w:pStyle w:val="NormalWeb"/>
-        <w:divId w:val="1702627145"/>
-        <w:rPr>
-          <w:rFonts w:ascii="Segoe UI" w:hAnsi="Segoe UI" w:cs="Segoe UI"/>
-          <w:color w:val="18181B"/>
-          <w:sz w:val="21"/>
-          <w:szCs w:val="21"/>
-          <w:lang w:val="en"/>
-        </w:rPr>
-      </w:pPr>
-      <w:r>
-        <w:rPr>
-          <w:rFonts w:ascii="Segoe UI" w:hAnsi="Segoe UI" w:cs="Segoe UI"/>
-          <w:color w:val="18181B"/>
-          <w:sz w:val="21"/>
-          <w:szCs w:val="21"/>
-          <w:lang w:val="en"/>
-        </w:rPr>
-        <w:t xml:space="preserve">Client-facing booking website, itinerary and tour management, mobile admin app with notifications, and booking/payment approval workflows. </w:t>
-      </w:r>
-    </w:p>
-    <w:p>
-      <w:pPr>
-        <w:pStyle w:val="tools1"/>
-        <w:divId w:val="1702627145"/>
-        <w:rPr>
-          <w:rFonts w:ascii="Segoe UI" w:hAnsi="Segoe UI" w:cs="Segoe UI"/>
-          <w:lang w:val="en"/>
-        </w:rPr>
-      </w:pPr>
-      <w:r>
-        <w:rPr>
-          <w:rFonts w:ascii="Segoe UI" w:hAnsi="Segoe UI" w:cs="Segoe UI"/>
-          <w:lang w:val="en"/>
-        </w:rPr>
-        <w:t xml:space="preserve">Laravel  ·  MySQL  ·  Web  ·  Mobile </w:t>
-      </w:r>
-    </w:p>
-    <w:p>
-      <w:pPr>
-        <w:pStyle w:val="Heading3"/>
-        <w:divId w:val="2118714963"/>
-        <w:rPr>
-          <w:rFonts w:ascii="Segoe UI" w:eastAsia="Times New Roman" w:hAnsi="Segoe UI" w:cs="Segoe UI"/>
-          <w:color w:val="18181B"/>
-          <w:lang w:val="en"/>
-        </w:rPr>
-      </w:pPr>
-      <w:r>
-        <w:rPr>
-          <w:rFonts w:ascii="Segoe UI" w:eastAsia="Times New Roman" w:hAnsi="Segoe UI" w:cs="Segoe UI"/>
-          <w:color w:val="18181B"/>
-          <w:lang w:val="en"/>
-        </w:rPr>
-        <w:t>Student Enrollment System</w:t>
-      </w:r>
-    </w:p>
-    <w:p>
-      <w:pPr>
-        <w:pStyle w:val="NormalWeb"/>
-        <w:divId w:val="2118714963"/>
-        <w:rPr>
-          <w:rFonts w:ascii="Segoe UI" w:hAnsi="Segoe UI" w:cs="Segoe UI"/>
-          <w:color w:val="18181B"/>
-          <w:sz w:val="21"/>
-          <w:szCs w:val="21"/>
-          <w:lang w:val="en"/>
-        </w:rPr>
-      </w:pPr>
-      <w:r>
-        <w:rPr>
-          <w:rFonts w:ascii="Segoe UI" w:hAnsi="Segoe UI" w:cs="Segoe UI"/>
-          <w:color w:val="18181B"/>
-          <w:sz w:val="21"/>
-          <w:szCs w:val="21"/>
-          <w:lang w:val="en"/>
-        </w:rPr>
-        <w:t xml:space="preserve">Backend for student enrollment: authentication, registration, course assignments, relational database, RESTful APIs, and role-based access control. </w:t>
-      </w:r>
-    </w:p>
-    <w:p>
-      <w:pPr>
-        <w:pStyle w:val="tools1"/>
-        <w:divId w:val="2118714963"/>
-        <w:rPr>
-          <w:rFonts w:ascii="Segoe UI" w:hAnsi="Segoe UI" w:cs="Segoe UI"/>
-          <w:lang w:val="en"/>
-        </w:rPr>
-      </w:pPr>
-      <w:r>
-        <w:rPr>
-          <w:rFonts w:ascii="Segoe UI" w:hAnsi="Segoe UI" w:cs="Segoe UI"/>
-          <w:lang w:val="en"/>
-        </w:rPr>
-        <w:t xml:space="preserve">PHP (Laravel)  ·  MySQL  ·  REST API </w:t>
-      </w:r>
-    </w:p>
-    <w:p>
-      <w:pPr>
-        <w:pStyle w:val="Heading3"/>
-        <w:divId w:val="558980324"/>
-        <w:rPr>
-          <w:rFonts w:ascii="Segoe UI" w:eastAsia="Times New Roman" w:hAnsi="Segoe UI" w:cs="Segoe UI"/>
-          <w:color w:val="18181B"/>
-          <w:lang w:val="en"/>
-        </w:rPr>
-      </w:pPr>
-      <w:r>
-        <w:rPr>
-          <w:rFonts w:ascii="Segoe UI" w:eastAsia="Times New Roman" w:hAnsi="Segoe UI" w:cs="Segoe UI"/>
-          <w:color w:val="18181B"/>
-          <w:lang w:val="en"/>
-        </w:rPr>
-        <w:t>Lending Management System</w:t>
-      </w:r>
-    </w:p>
-    <w:p>
-      <w:pPr>
-        <w:pStyle w:val="NormalWeb"/>
-        <w:divId w:val="558980324"/>
-        <w:rPr>
-          <w:rFonts w:ascii="Segoe UI" w:hAnsi="Segoe UI" w:cs="Segoe UI"/>
-          <w:color w:val="18181B"/>
-          <w:sz w:val="21"/>
-          <w:szCs w:val="21"/>
-          <w:lang w:val="en"/>
-        </w:rPr>
-      </w:pPr>
-      <w:r>
-        <w:rPr>
-          <w:rFonts w:ascii="Segoe UI" w:hAnsi="Segoe UI" w:cs="Segoe UI"/>
-          <w:color w:val="18181B"/>
-          <w:sz w:val="21"/>
-          <w:szCs w:val="21"/>
-          <w:lang w:val="en"/>
-        </w:rPr>
-        <w:t xml:space="preserve">Standalone Windows desktop app with loan tracking, payment scheduling, interest calculation, and MySQL data storage. </w:t>
-      </w:r>
-    </w:p>
-    <w:p>
-      <w:pPr>
-        <w:pStyle w:val="tools1"/>
-        <w:divId w:val="558980324"/>
-        <w:rPr>
-          <w:rFonts w:ascii="Segoe UI" w:hAnsi="Segoe UI" w:cs="Segoe UI"/>
-          <w:lang w:val="en"/>
-        </w:rPr>
-      </w:pPr>
-      <w:r>
-        <w:rPr>
-          <w:rFonts w:ascii="Segoe UI" w:hAnsi="Segoe UI" w:cs="Segoe UI"/>
-          <w:lang w:val="en"/>
-        </w:rPr>
-        <w:t>C#  ·  .NET Framework  ·  MySQL</w:t>
-      </w:r>
-    </w:p>
-    <w:p>
-      <w:pPr>
-        <w:pStyle w:val="Heading3"/>
-        <w:divId w:val="721559312"/>
-        <w:rPr>
-          <w:rFonts w:ascii="Segoe UI" w:eastAsia="Times New Roman" w:hAnsi="Segoe UI" w:cs="Segoe UI"/>
-          <w:color w:val="18181B"/>
-          <w:lang w:val="en"/>
-        </w:rPr>
-      </w:pPr>
-      <w:r>
-        <w:rPr>
-          <w:rFonts w:ascii="Segoe UI" w:eastAsia="Times New Roman" w:hAnsi="Segoe UI" w:cs="Segoe UI"/>
-          <w:color w:val="18181B"/>
-          <w:lang w:val="en"/>
-        </w:rPr>
-        <w:t>Desktop POS System — Pizza Restaurant</w:t>
-      </w:r>
-    </w:p>
-    <w:p>
-      <w:pPr>
-        <w:pStyle w:val="NormalWeb"/>
-        <w:divId w:val="721559312"/>
-        <w:rPr>
-          <w:rFonts w:ascii="Segoe UI" w:hAnsi="Segoe UI" w:cs="Segoe UI"/>
-          <w:color w:val="18181B"/>
-          <w:sz w:val="21"/>
-          <w:szCs w:val="21"/>
-          <w:lang w:val="en"/>
-        </w:rPr>
-      </w:pPr>
-      <w:r>
-        <w:rPr>
-          <w:rFonts w:ascii="Segoe UI" w:hAnsi="Segoe UI" w:cs="Segoe UI"/>
-          <w:color w:val="18181B"/>
-          <w:sz w:val="21"/>
-          <w:szCs w:val="21"/>
-          <w:lang w:val="en"/>
-        </w:rPr>
-        <w:t xml:space="preserve">Desktop point-of-sales for orders, products, inventory, and sales transactions; independent college project. </w:t>
-      </w:r>
-    </w:p>
-    <w:p>
-      <w:pPr>
-        <w:pStyle w:val="tools1"/>
-        <w:divId w:val="721559312"/>
-        <w:rPr>
-          <w:rFonts w:ascii="Segoe UI" w:hAnsi="Segoe UI" w:cs="Segoe UI"/>
-          <w:lang w:val="en"/>
-        </w:rPr>
-      </w:pPr>
-      <w:r>
-        <w:rPr>
-          <w:rFonts w:ascii="Segoe UI" w:hAnsi="Segoe UI" w:cs="Segoe UI"/>
-          <w:lang w:val="en"/>
-        </w:rPr>
-        <w:t xml:space="preserve">C#  ·  Visual Studio  ·  SQL Server  ·  SSMS </w:t>
-      </w:r>
-    </w:p>
-    <w:p>
-      <w:pPr>
-        <w:pStyle w:val="Heading3"/>
-        <w:divId w:val="846402645"/>
-        <w:rPr>
-          <w:rFonts w:ascii="Segoe UI" w:eastAsia="Times New Roman" w:hAnsi="Segoe UI" w:cs="Segoe UI"/>
-          <w:color w:val="18181B"/>
-          <w:lang w:val="en"/>
-        </w:rPr>
-      </w:pPr>
-      <w:r>
-        <w:rPr>
-          <w:rFonts w:ascii="Segoe UI" w:eastAsia="Times New Roman" w:hAnsi="Segoe UI" w:cs="Segoe UI"/>
-          <w:color w:val="18181B"/>
-          <w:lang w:val="en"/>
-        </w:rPr>
-        <w:t>Educational Multiplayer Math Game</w:t>
-      </w:r>
-    </w:p>
-    <w:p>
-      <w:pPr>
-        <w:pStyle w:val="NormalWeb"/>
-        <w:divId w:val="846402645"/>
-        <w:rPr>
-          <w:rFonts w:ascii="Segoe UI" w:hAnsi="Segoe UI" w:cs="Segoe UI"/>
-          <w:color w:val="18181B"/>
-          <w:sz w:val="21"/>
-          <w:szCs w:val="21"/>
-          <w:lang w:val="en"/>
-        </w:rPr>
-      </w:pPr>
-      <w:r>
-        <w:rPr>
-          <w:rFonts w:ascii="Segoe UI" w:hAnsi="Segoe UI" w:cs="Segoe UI"/>
-          <w:color w:val="18181B"/>
-          <w:sz w:val="21"/>
-          <w:szCs w:val="21"/>
-          <w:lang w:val="en"/>
-        </w:rPr>
-        <w:t xml:space="preserve">Prototype multiplayer math-learning mobile game with real-time Node.js / Socket.IO backend. </w:t>
-      </w:r>
-    </w:p>
-    <w:p>
-      <w:pPr>
-        <w:pStyle w:val="tools1"/>
-        <w:divId w:val="846402645"/>
-        <w:rPr>
-          <w:rFonts w:ascii="Segoe UI" w:hAnsi="Segoe UI" w:cs="Segoe UI"/>
-          <w:lang w:val="en"/>
-        </w:rPr>
-      </w:pPr>
-      <w:r>
-        <w:rPr>
-          <w:rFonts w:ascii="Segoe UI" w:hAnsi="Segoe UI" w:cs="Segoe UI"/>
-          <w:lang w:val="en"/>
-        </w:rPr>
-        <w:t>Java  ·  Node.js  ·  Socket.IO</w:t>
-      </w:r>
-    </w:p>
-    <w:p>
-      <w:pPr>
-        <w:pStyle w:val="Heading3"/>
-        <w:divId w:val="450831315"/>
-        <w:rPr>
-          <w:rFonts w:ascii="Segoe UI" w:eastAsia="Times New Roman" w:hAnsi="Segoe UI" w:cs="Segoe UI"/>
-          <w:color w:val="18181B"/>
-          <w:lang w:val="en"/>
-        </w:rPr>
-      </w:pPr>
-      <w:r>
-        <w:rPr>
-          <w:rFonts w:ascii="Segoe UI" w:eastAsia="Times New Roman" w:hAnsi="Segoe UI" w:cs="Segoe UI"/>
-          <w:color w:val="18181B"/>
-          <w:lang w:val="en"/>
-        </w:rPr>
-        <w:t>Laundry Shop Web &amp; Mobile Application</w:t>
-      </w:r>
-    </w:p>
-    <w:p>
-      <w:pPr>
-        <w:pStyle w:val="NormalWeb"/>
-        <w:divId w:val="450831315"/>
-        <w:rPr>
-          <w:rFonts w:ascii="Segoe UI" w:hAnsi="Segoe UI" w:cs="Segoe UI"/>
-          <w:color w:val="18181B"/>
-          <w:sz w:val="21"/>
-          <w:szCs w:val="21"/>
-          <w:lang w:val="en"/>
-        </w:rPr>
-      </w:pPr>
-      <w:r>
-        <w:rPr>
-          <w:rFonts w:ascii="Segoe UI" w:hAnsi="Segoe UI" w:cs="Segoe UI"/>
-          <w:color w:val="18181B"/>
-          <w:sz w:val="21"/>
-          <w:szCs w:val="21"/>
-          <w:lang w:val="en"/>
-        </w:rPr>
-        <w:t xml:space="preserve">Full-stack web and mobile app with customer management, payment integration, and responsive UI. </w:t>
-      </w:r>
-    </w:p>
-    <w:p>
-      <w:pPr>
-        <w:pStyle w:val="tools1"/>
-        <w:divId w:val="450831315"/>
-        <w:rPr>
-          <w:rFonts w:ascii="Segoe UI" w:hAnsi="Segoe UI" w:cs="Segoe UI"/>
-          <w:lang w:val="en"/>
-        </w:rPr>
-      </w:pPr>
-      <w:r>
-        <w:rPr>
-          <w:rFonts w:ascii="Segoe UI" w:hAnsi="Segoe UI" w:cs="Segoe UI"/>
-          <w:lang w:val="en"/>
-        </w:rPr>
-        <w:lastRenderedPageBreak/>
+        <w:divId w:val="1060713229"/>
+        <w:rPr>
+          <w:rFonts w:ascii="Segoe UI" w:hAnsi="Segoe UI" w:cs="Segoe UI"/>
+          <w:lang w:val="en"/>
+        </w:rPr>
+      </w:pPr>
+      <w:r>
+        <w:rPr>
+          <w:rFonts w:ascii="Segoe UI" w:hAnsi="Segoe UI" w:cs="Segoe UI"/>
+          <w:lang w:val="en"/>
+        </w:rPr>
         <w:t>Full-Stack  ·  Web  ·  Mobile</w:t>
       </w:r>
     </w:p>
@@ -1695,9 +1756,9 @@
 <file path=word/numbering.xml><?xml version="1.0" encoding="utf-8"?>
 <w:numbering xmlns:wpc="http://schemas.microsoft.com/office/word/2010/wordprocessingCanvas" xmlns:cx="http://schemas.microsoft.com/office/drawing/2014/chartex" xmlns:cx1="http://schemas.microsoft.com/office/drawing/2015/9/8/chartex" xmlns:cx2="http://schemas.microsoft.com/office/drawing/2015/10/21/chartex" xmlns:cx3="http://schemas.microsoft.com/office/drawing/2016/5/9/chartex" xmlns:cx4="http://schemas.microsoft.com/office/drawing/2016/5/10/chartex" xmlns:cx5="http://schemas.microsoft.com/office/drawing/2016/5/11/chartex" xmlns:cx6="http://schemas.microsoft.com/office/drawing/2016/5/12/chartex" xmlns:cx7="http://schemas.microsoft.com/office/drawing/2016/5/13/chartex" xmlns:cx8="http://schemas.microsoft.com/office/drawing/2016/5/14/chartex" xmlns:mc="http://schemas.openxmlformats.org/markup-compatibility/2006" xmlns:aink="http://schemas.microsoft.com/office/drawing/2016/ink" xmlns:am3d="http://schemas.microsoft.com/office/drawing/2017/model3d" xmlns:o="urn:schemas-microsoft-com:office:office" xmlns:oel="http://schemas.microsoft.com/office/2019/extlst" xmlns:r="http://schemas.openxmlformats.org/officeDocument/2006/relationships" xmlns:m="http://schemas.openxmlformats.org/officeDocument/2006/math" xmlns:v="urn:schemas-microsoft-com:vml" xmlns:wp14="http://schemas.microsoft.com/office/word/2010/wordprocessingDrawing" xmlns:wp="http://schemas.openxmlformats.org/drawingml/2006/wordprocessingDrawing" xmlns:w10="urn:schemas-microsoft-com:office:word" xmlns:w="http://schemas.openxmlformats.org/wordprocessingml/2006/main" xmlns:w14="http://schemas.microsoft.com/office/word/2010/wordml" xmlns:w15="http://schemas.microsoft.com/office/word/2012/wordml" xmlns:w16cex="http://schemas.microsoft.com/office/word/2018/wordml/cex" xmlns:w16cid="http://schemas.microsoft.com/office/word/2016/wordml/cid" xmlns:w16="http://schemas.microsoft.com/office/word/2018/wordml" xmlns:w16du="http://schemas.microsoft.com/office/word/2023/wordml/word16du" xmlns:w16sdtdh="http://schemas.microsoft.com/office/word/2020/wordml/sdtdatahash" xmlns:w16sdtfl="http://schemas.microsoft.com/office/word/2024/wordml/sdtformatlock" xmlns:w16se="http://schemas.microsoft.com/office/word/2015/wordml/symex" xmlns:wpg="http://schemas.microsoft.com/office/word/2010/wordprocessingGroup" xmlns:wpi="http://schemas.microsoft.com/office/word/2010/wordprocessingInk" xmlns:wne="http://schemas.microsoft.com/office/word/2006/wordml" xmlns:wps="http://schemas.microsoft.com/office/word/2010/wordprocessingShape" mc:Ignorable="w14 w15 w16se w16cid w16 w16cex w16sdtdh w16sdtfl w16du wp14">
   <w:abstractNum w:abstractNumId="0" w15:restartNumberingAfterBreak="0">
-    <w:nsid w:val="4FED7208"/>
+    <w:nsid w:val="0A621298"/>
     <w:multiLevelType w:val="multilevel"/>
-    <w:tmpl w:val="EA9AA494"/>
+    <w:tmpl w:val="FFD09568"/>
     <w:lvl w:ilvl="0">
       <w:start w:val="1"/>
       <w:numFmt w:val="bullet"/>
@@ -1844,9 +1905,9 @@
     </w:lvl>
   </w:abstractNum>
   <w:abstractNum w:abstractNumId="1" w15:restartNumberingAfterBreak="0">
-    <w:nsid w:val="627D269E"/>
+    <w:nsid w:val="0DF94C25"/>
     <w:multiLevelType w:val="multilevel"/>
-    <w:tmpl w:val="4B22A8F6"/>
+    <w:tmpl w:val="DFF2E7CE"/>
     <w:lvl w:ilvl="0">
       <w:start w:val="1"/>
       <w:numFmt w:val="bullet"/>
@@ -1993,9 +2054,9 @@
     </w:lvl>
   </w:abstractNum>
   <w:abstractNum w:abstractNumId="2" w15:restartNumberingAfterBreak="0">
-    <w:nsid w:val="73816835"/>
+    <w:nsid w:val="222A66C7"/>
     <w:multiLevelType w:val="multilevel"/>
-    <w:tmpl w:val="171836AC"/>
+    <w:tmpl w:val="68D29868"/>
     <w:lvl w:ilvl="0">
       <w:start w:val="1"/>
       <w:numFmt w:val="bullet"/>
@@ -2142,9 +2203,9 @@
     </w:lvl>
   </w:abstractNum>
   <w:abstractNum w:abstractNumId="3" w15:restartNumberingAfterBreak="0">
-    <w:nsid w:val="7EF130B3"/>
+    <w:nsid w:val="70925EEB"/>
     <w:multiLevelType w:val="multilevel"/>
-    <w:tmpl w:val="ED4AB220"/>
+    <w:tmpl w:val="3F76E9FC"/>
     <w:lvl w:ilvl="0">
       <w:start w:val="1"/>
       <w:numFmt w:val="bullet"/>
@@ -2290,17 +2351,17 @@
       </w:rPr>
     </w:lvl>
   </w:abstractNum>
-  <w:num w:numId="1" w16cid:durableId="965427903">
+  <w:num w:numId="1" w16cid:durableId="1011175953">
     <w:abstractNumId w:val="1"/>
   </w:num>
-  <w:num w:numId="2" w16cid:durableId="955647405">
-    <w:abstractNumId w:val="0"/>
+  <w:num w:numId="2" w16cid:durableId="938026285">
+    <w:abstractNumId w:val="2"/>
   </w:num>
-  <w:num w:numId="3" w16cid:durableId="332682858">
+  <w:num w:numId="3" w16cid:durableId="410393931">
     <w:abstractNumId w:val="3"/>
   </w:num>
-  <w:num w:numId="4" w16cid:durableId="1810242494">
-    <w:abstractNumId w:val="2"/>
+  <w:num w:numId="4" w16cid:durableId="581836689">
+    <w:abstractNumId w:val="0"/>
   </w:num>
 </w:numbering>
 </file>

</xml_diff>